<commit_message>
feat: complete MVP implementation with Docker, CI/CD, init-db schema, frontend pages and microservices configs
</commit_message>
<xml_diff>
--- a/PRJ-QUICK-REVIEW-PRE-OJT-03 .docx
+++ b/PRJ-QUICK-REVIEW-PRE-OJT-03 .docx
@@ -323,7 +323,7 @@
           <w:szCs w:val="28"/>
           <w:rtl w:val="0"/>
         </w:rPr>
-        <w:t xml:space="preserve">Tài liệu này đặc tả các yêu cầu kỹ thuật và chức năng cho dự án Hệ thống quản lý đào tạo và đăng ký học phần (Student Information System - MVP). Được thiết kế riêng cho chu kỳ phát triển 1 tuần với đội ngũ 6 người, tài liệu định hướng rõ ràng phạm vi công nghệ, cấu trúc hệ thống (Cổng sinh viên, Cổng giảng viên, Trang quản trị), thiết kế REST API, cũng như quy trình phối hợp DevOps (CI/CD, đa môi trường) và AI-driven development.</w:t>
+        <w:t xml:space="preserve">Tài liệu này đặc tả các yêu cầu kỹ thuật và chức năng cho dự án Hệ thống quản lý đào tạo và đăng ký học phần (Student Information System - MVP). Được thiết kế riêng cho chu kỳ phát triển 1 tuần với đội ngũ 5 thành viên, tài liệu định hướng rõ ràng phạm vi công nghệ, cấu trúc hệ thống (Cổng sinh viên, Cổng giảng viên, Trang quản trị), thiết kế REST API, cũng như quy trình phối hợp DevOps (CI/CD, đa môi trường) và AI-driven development.</w:t>
       </w:r>
     </w:p>
     <w:p>
@@ -385,7 +385,7 @@
           <w:szCs w:val="28"/>
           <w:rtl w:val="0"/>
         </w:rPr>
-        <w:t xml:space="preserve"> 5-6 thành viên / 1 nhóm</w:t>
+        <w:t xml:space="preserve"> 5 thành viên / 1 nhóm</w:t>
       </w:r>
     </w:p>
     <w:p>
@@ -409,7 +409,7 @@
           <w:szCs w:val="28"/>
           <w:rtl w:val="0"/>
         </w:rPr>
-        <w:t xml:space="preserve">Nguyễn Sơn MinhTeam Lead / AI Integrator):</w:t>
+        <w:t xml:space="preserve">Member 1 (Team Lead / AI Integrator):</w:t>
       </w:r>
       <w:r>
         <w:rPr>
@@ -441,7 +441,7 @@
           <w:szCs w:val="28"/>
           <w:rtl w:val="0"/>
         </w:rPr>
-        <w:t xml:space="preserve">Member 2, 3, 4 &amp; 5 (Full-stack Developers):</w:t>
+        <w:t xml:space="preserve">Member 2, 3, 4 (Full-stack Developers):</w:t>
       </w:r>
     </w:p>
     <w:p>
@@ -529,15 +529,15 @@
           <w:szCs w:val="28"/>
           <w:rtl w:val="0"/>
         </w:rPr>
-        <w:t xml:space="preserve">Member 6 (QA / Tester / DevOps):</w:t>
-      </w:r>
-      <w:r>
-        <w:rPr>
-          <w:sz w:val="28"/>
-          <w:szCs w:val="28"/>
-          <w:rtl w:val="0"/>
-        </w:rPr>
-        <w:t xml:space="preserve"> Kiểm thử End-to-End (E2E), kiểm thử tự động API (Postman/Newman hoặc REST Assured). Thiết lập Docker, Docker Compose đa môi trường (</w:t>
+        <w:t xml:space="preserve">Member 5 (Full-stack Dev / QA / DevOps):</w:t>
+      </w:r>
+      <w:r>
+        <w:rPr>
+          <w:sz w:val="28"/>
+          <w:szCs w:val="28"/>
+          <w:rtl w:val="0"/>
+        </w:rPr>
+        <w:t xml:space="preserve"> Phụ trách Cổng Giảng viên &amp; Quản lý điểm số. Đồng thời kiêm nhiệm kiềm thử End-to-End (E2E), kiểm thử tự động API (Postman/Newman), thiết lập Docker/Docker Compose đa môi trường (</w:t>
       </w:r>
       <w:r>
         <w:rPr>
@@ -588,7 +588,7 @@
           <w:szCs w:val="28"/>
           <w:rtl w:val="0"/>
         </w:rPr>
-        <w:t xml:space="preserve">), cấu hình GitHub Actions (CI/CD) và hỗ trợ deploy hệ thống.</w:t>
+        <w:t xml:space="preserve">) và cấu hình GitHub Actions (CI/CD) triển khai hệ thống.</w:t>
       </w:r>
     </w:p>
     <w:p>
@@ -3426,7 +3426,7 @@
           <w:szCs w:val="28"/>
           <w:rtl w:val="0"/>
         </w:rPr>
-        <w:t xml:space="preserve"> 100% các thành phần của hệ thống (Frontend, Backend, PostgreSQL Database) phải được đóng gói bằng Docker và tách biệt cấu hình môi trường thông qua biến môi trường để đảm bảo tính nhất quán giữa máy Local của 6 thành viên và Server.</w:t>
+        <w:t xml:space="preserve"> 100% các thành phần của hệ thống (Frontend, Backend, PostgreSQL Database) phải được đóng gói bằng Docker và tách biệt cấu hình môi trường thông qua biến môi trường để đảm bảo tính nhất quán giữa máy Local của 5 thành viên và Server.</w:t>
       </w:r>
     </w:p>
     <w:p>
@@ -7653,7 +7653,7 @@
           <w:szCs w:val="28"/>
           <w:rtl w:val="0"/>
         </w:rPr>
-        <w:t xml:space="preserve"> và cập nhật lại CGPA cho sinh viên.</w:t>
+        <w:t xml:space="preserve"> và cập nhật lại C-GPA cho sinh viên.</w:t>
       </w:r>
     </w:p>
     <w:p>
@@ -8041,13 +8041,7 @@
         <w:keepNext w:val="0"/>
         <w:keepLines w:val="0"/>
         <w:spacing w:before="0" w:lineRule="auto"/>
-        <w:rPr>
-          <w:b w:val="1"/>
-          <w:bCs w:val="1"/>
-          <w:color w:val="000000"/>
-          <w:sz w:val="26"/>
-          <w:szCs w:val="26"/>
-        </w:rPr>
+        <w:rPr/>
       </w:pPr>
       <w:bookmarkStart w:colFirst="0" w:colLast="0" w:name="_1wscm48zjlyf" w:id="32"/>
       <w:bookmarkEnd w:id="32"/>
@@ -8058,29 +8052,42 @@
           <w:color w:val="1155cc"/>
           <w:rtl w:val="0"/>
         </w:rPr>
-        <w:t xml:space="preserve">8. Phân chia công việc chi tiết (Task Allocation cho 6 thành viên - Sprint 7 ngày)</w:t>
-      </w:r>
-      <w:r>
-        <w:rPr>
-          <w:rtl w:val="0"/>
-        </w:rPr>
-      </w:r>
-    </w:p>
-    <w:p>
-      <w:pPr>
-        <w:spacing w:after="240" w:lineRule="auto"/>
-        <w:rPr>
-          <w:sz w:val="28"/>
-          <w:szCs w:val="28"/>
-        </w:rPr>
-      </w:pPr>
-      <w:r>
-        <w:rPr>
-          <w:sz w:val="28"/>
-          <w:szCs w:val="28"/>
-          <w:rtl w:val="0"/>
-        </w:rPr>
-        <w:t xml:space="preserve">Để tránh dẫm chân nhau khi code chung 1 repo, nhóm có thể chia module theo chiều dọc (Full-stack theo tính năng) như sau:</w:t>
+        <w:t xml:space="preserve">8. Phân chia công việc chi tiết (Task Allocation cho 5 thành viên - Sprint 7 ngày)</w:t>
+      </w:r>
+      <w:r>
+        <w:rPr>
+          <w:rtl w:val="0"/>
+        </w:rPr>
+      </w:r>
+    </w:p>
+    <w:p>
+      <w:pPr>
+        <w:rPr/>
+      </w:pPr>
+      <w:r>
+        <w:rPr>
+          <w:rtl w:val="0"/>
+        </w:rPr>
+      </w:r>
+    </w:p>
+    <w:p>
+      <w:pPr>
+        <w:rPr/>
+      </w:pPr>
+      <w:r>
+        <w:rPr>
+          <w:rtl w:val="0"/>
+        </w:rPr>
+      </w:r>
+    </w:p>
+    <w:p>
+      <w:pPr>
+        <w:rPr/>
+      </w:pPr>
+      <w:r>
+        <w:rPr>
+          <w:rtl w:val="0"/>
+        </w:rPr>
       </w:r>
     </w:p>
     <w:p>
@@ -8138,7 +8145,6 @@
           </w:tcPr>
           <w:p>
             <w:pPr>
-              <w:spacing w:line="276" w:lineRule="auto"/>
               <w:jc w:val="center"/>
               <w:rPr/>
             </w:pPr>
@@ -8170,7 +8176,6 @@
           </w:tcPr>
           <w:p>
             <w:pPr>
-              <w:spacing w:line="276" w:lineRule="auto"/>
               <w:jc w:val="center"/>
               <w:rPr/>
             </w:pPr>
@@ -8202,7 +8207,6 @@
           </w:tcPr>
           <w:p>
             <w:pPr>
-              <w:spacing w:line="276" w:lineRule="auto"/>
               <w:jc w:val="center"/>
               <w:rPr/>
             </w:pPr>
@@ -8240,7 +8244,6 @@
           </w:tcPr>
           <w:p>
             <w:pPr>
-              <w:spacing w:line="276" w:lineRule="auto"/>
               <w:rPr/>
             </w:pPr>
             <w:r>
@@ -8249,7 +8252,7 @@
                 <w:bCs w:val="1"/>
                 <w:rtl w:val="0"/>
               </w:rPr>
-              <w:t xml:space="preserve">Member 1</w:t>
+              <w:t xml:space="preserve">Nguyễn Sơn Minh</w:t>
             </w:r>
             <w:r>
               <w:rPr>
@@ -8270,7 +8273,6 @@
           </w:tcPr>
           <w:p>
             <w:pPr>
-              <w:spacing w:line="276" w:lineRule="auto"/>
               <w:rPr/>
             </w:pPr>
             <w:r>
@@ -8300,7 +8302,6 @@
           </w:tcPr>
           <w:p>
             <w:pPr>
-              <w:spacing w:line="276" w:lineRule="auto"/>
               <w:rPr/>
             </w:pPr>
             <w:r>
@@ -8309,7 +8310,7 @@
               </w:rPr>
               <w:t xml:space="preserve">- Khởi tạo khung Project Spring Boot &amp; ReactJS (Vite + Tailwind + Zustand).</w:t>
               <w:br w:type="textWrapping"/>
-              <w:t xml:space="preserve">- Thiết kế file SQL khởi tạo PostgreSQL &amp; Seed Data chuẩn như ảnh mẫu.</w:t>
+              <w:t xml:space="preserve">- Thiết kế SQL khởi tạo DB PostgreSQL &amp; Seed Data.</w:t>
               <w:br w:type="textWrapping"/>
               <w:t xml:space="preserve">- Phát triển Module </w:t>
             </w:r>
@@ -8325,9 +8326,9 @@
               <w:rPr>
                 <w:rtl w:val="0"/>
               </w:rPr>
-              <w:t xml:space="preserve"> (Spring AI Syllabus Generator + Chatbot UI).</w:t>
+              <w:t xml:space="preserve"> (BE: Spring AI Syllabus Generator &amp; Academic Advisor Chatbot; FE: UI Chatbot Advisor &amp; nút Sinh đề cương AI).</w:t>
               <w:br w:type="textWrapping"/>
-              <w:t xml:space="preserve">- Review code, hỗ trợ xử lý phần Locking khi đăng ký tín chỉ.</w:t>
+              <w:t xml:space="preserve">- Review code toàn bộ nhóm &amp; quản lý tiến độ Sprint.</w:t>
             </w:r>
           </w:p>
         </w:tc>
@@ -8348,7 +8349,6 @@
           </w:tcPr>
           <w:p>
             <w:pPr>
-              <w:spacing w:line="276" w:lineRule="auto"/>
               <w:rPr/>
             </w:pPr>
             <w:r>
@@ -8357,7 +8357,7 @@
                 <w:bCs w:val="1"/>
                 <w:rtl w:val="0"/>
               </w:rPr>
-              <w:t xml:space="preserve">Member 2</w:t>
+              <w:t xml:space="preserve">Nguyễn Quang Vinh</w:t>
             </w:r>
             <w:r>
               <w:rPr>
@@ -8377,7 +8377,6 @@
           </w:tcPr>
           <w:p>
             <w:pPr>
-              <w:spacing w:line="276" w:lineRule="auto"/>
               <w:rPr/>
             </w:pPr>
             <w:r>
@@ -8393,7 +8392,7 @@
                 <w:rtl w:val="0"/>
               </w:rPr>
               <w:br w:type="textWrapping"/>
-              <w:t xml:space="preserve">(Auth &amp; Admin User)</w:t>
+              <w:t xml:space="preserve">(Auth, User &amp; DevOps Co-Lead)</w:t>
             </w:r>
           </w:p>
         </w:tc>
@@ -8408,7 +8407,6 @@
           </w:tcPr>
           <w:p>
             <w:pPr>
-              <w:spacing w:line="276" w:lineRule="auto"/>
               <w:rPr/>
             </w:pPr>
             <w:r>
@@ -8416,6 +8414,21 @@
                 <w:rtl w:val="0"/>
               </w:rPr>
               <w:t xml:space="preserve">- </w:t>
+            </w:r>
+            <w:r>
+              <w:rPr>
+                <w:b w:val="1"/>
+                <w:bCs w:val="1"/>
+                <w:rtl w:val="0"/>
+              </w:rPr>
+              <w:t xml:space="preserve">Auth &amp; User Profile:</w:t>
+            </w:r>
+            <w:r>
+              <w:rPr>
+                <w:rtl w:val="0"/>
+              </w:rPr>
+              <w:br w:type="textWrapping"/>
+              <w:t xml:space="preserve">  + </w:t>
             </w:r>
             <w:r>
               <w:rPr>
@@ -8442,7 +8455,7 @@
               <w:rPr>
                 <w:rtl w:val="0"/>
               </w:rPr>
-              <w:t xml:space="preserve">), API </w:t>
+              <w:t xml:space="preserve">), API Profile (</w:t>
             </w:r>
             <w:r>
               <w:rPr>
@@ -8455,9 +8468,9 @@
               <w:rPr>
                 <w:rtl w:val="0"/>
               </w:rPr>
-              <w:t xml:space="preserve">, API Admin quản lý Hồ sơ Sinh viên &amp; Giảng viên.</w:t>
+              <w:t xml:space="preserve">), CRUD Hồ sơ Sinh viên &amp; Giảng viên cho Admin.</w:t>
               <w:br w:type="textWrapping"/>
-              <w:t xml:space="preserve">- </w:t>
+              <w:t xml:space="preserve">  + </w:t>
             </w:r>
             <w:r>
               <w:rPr>
@@ -8471,7 +8484,23 @@
               <w:rPr>
                 <w:rtl w:val="0"/>
               </w:rPr>
-              <w:t xml:space="preserve"> Trang Login, Layout chung (Sidebar theo mẫu UI), Trang Quản lý Sinh viên/Giảng viên của Admin.</w:t>
+              <w:t xml:space="preserve"> Trang Đăng nhập, Khung Layout chung (Sidebar navigation), Trang Quản lý Hồ sơ &amp; Trang Hồ sơ cá nhân.</w:t>
+              <w:br w:type="textWrapping"/>
+              <w:t xml:space="preserve">- </w:t>
+            </w:r>
+            <w:r>
+              <w:rPr>
+                <w:b w:val="1"/>
+                <w:bCs w:val="1"/>
+                <w:rtl w:val="0"/>
+              </w:rPr>
+              <w:t xml:space="preserve">DevOps Core:</w:t>
+            </w:r>
+            <w:r>
+              <w:rPr>
+                <w:rtl w:val="0"/>
+              </w:rPr>
+              <w:t xml:space="preserve"> Đóng gói Dockerfile, thiết lập Docker Compose cho môi trường dev/staging/prod.</w:t>
             </w:r>
           </w:p>
         </w:tc>
@@ -8493,7 +8522,6 @@
           </w:tcPr>
           <w:p>
             <w:pPr>
-              <w:spacing w:line="276" w:lineRule="auto"/>
               <w:rPr/>
             </w:pPr>
             <w:r>
@@ -8502,7 +8530,7 @@
                 <w:bCs w:val="1"/>
                 <w:rtl w:val="0"/>
               </w:rPr>
-              <w:t xml:space="preserve">Member 3</w:t>
+              <w:t xml:space="preserve">Hoàng Cương Cát</w:t>
             </w:r>
             <w:r>
               <w:rPr>
@@ -8523,7 +8551,6 @@
           </w:tcPr>
           <w:p>
             <w:pPr>
-              <w:spacing w:line="276" w:lineRule="auto"/>
               <w:rPr/>
             </w:pPr>
             <w:r>
@@ -8539,7 +8566,7 @@
                 <w:rtl w:val="0"/>
               </w:rPr>
               <w:br w:type="textWrapping"/>
-              <w:t xml:space="preserve">(Course &amp; Class Section)</w:t>
+              <w:t xml:space="preserve">(Academic Catalog &amp; Class Operations)</w:t>
             </w:r>
           </w:p>
         </w:tc>
@@ -8555,7 +8582,6 @@
           </w:tcPr>
           <w:p>
             <w:pPr>
-              <w:spacing w:line="276" w:lineRule="auto"/>
               <w:rPr/>
             </w:pPr>
             <w:r>
@@ -8563,6 +8589,21 @@
                 <w:rtl w:val="0"/>
               </w:rPr>
               <w:t xml:space="preserve">- </w:t>
+            </w:r>
+            <w:r>
+              <w:rPr>
+                <w:b w:val="1"/>
+                <w:bCs w:val="1"/>
+                <w:rtl w:val="0"/>
+              </w:rPr>
+              <w:t xml:space="preserve">Quản lý Danh mục Môn học &amp; Lớp học phần:</w:t>
+            </w:r>
+            <w:r>
+              <w:rPr>
+                <w:rtl w:val="0"/>
+              </w:rPr>
+              <w:br w:type="textWrapping"/>
+              <w:t xml:space="preserve">  + </w:t>
             </w:r>
             <w:r>
               <w:rPr>
@@ -8589,7 +8630,7 @@
               <w:rPr>
                 <w:rtl w:val="0"/>
               </w:rPr>
-              <w:t xml:space="preserve">) và Mở lớp học phần (</w:t>
+              <w:t xml:space="preserve">), API Mở lớp học phần (</w:t>
             </w:r>
             <w:r>
               <w:rPr>
@@ -8602,9 +8643,36 @@
               <w:rPr>
                 <w:rtl w:val="0"/>
               </w:rPr>
-              <w:t xml:space="preserve">), kiểm tra trùng phòng học/giảng viên khi tạo lớp.</w:t>
+              <w:t xml:space="preserve">), validate trùng phòng học/giảng viên &amp; API Admin duyệt đăng ký (</w:t>
+            </w:r>
+            <w:r>
+              <w:rPr>
+                <w:color w:val="188038"/>
+                <w:rtl w:val="0"/>
+              </w:rPr>
+              <w:t xml:space="preserve">PENDING</w:t>
+            </w:r>
+            <w:r>
+              <w:rPr>
+                <w:rFonts w:ascii="Arial Unicode MS" w:cs="Arial Unicode MS" w:eastAsia="Arial Unicode MS" w:hAnsi="Arial Unicode MS"/>
+                <w:rtl w:val="0"/>
+              </w:rPr>
+              <w:t xml:space="preserve"> → </w:t>
+            </w:r>
+            <w:r>
+              <w:rPr>
+                <w:color w:val="188038"/>
+                <w:rtl w:val="0"/>
+              </w:rPr>
+              <w:t xml:space="preserve">REGISTERED</w:t>
+            </w:r>
+            <w:r>
+              <w:rPr>
+                <w:rtl w:val="0"/>
+              </w:rPr>
+              <w:t xml:space="preserve">).</w:t>
               <w:br w:type="textWrapping"/>
-              <w:t xml:space="preserve">- </w:t>
+              <w:t xml:space="preserve">  + </w:t>
             </w:r>
             <w:r>
               <w:rPr>
@@ -8618,7 +8686,7 @@
               <w:rPr>
                 <w:rtl w:val="0"/>
               </w:rPr>
-              <w:t xml:space="preserve"> Trang Quản lý Môn học (tích hợp nút gọi AI tạo đề cương) và Trang Mở lớp học phần của Admin.</w:t>
+              <w:t xml:space="preserve"> Trang Quản lý Danh mục Môn học &amp; Trang Quản lý Lớp học phần/Duyệt đăng ký (Admin Portal).</w:t>
             </w:r>
           </w:p>
         </w:tc>
@@ -8639,7 +8707,6 @@
           </w:tcPr>
           <w:p>
             <w:pPr>
-              <w:spacing w:line="276" w:lineRule="auto"/>
               <w:rPr/>
             </w:pPr>
             <w:r>
@@ -8648,7 +8715,7 @@
                 <w:bCs w:val="1"/>
                 <w:rtl w:val="0"/>
               </w:rPr>
-              <w:t xml:space="preserve">Member 4</w:t>
+              <w:t xml:space="preserve">Phạm Viết Quân</w:t>
             </w:r>
             <w:r>
               <w:rPr>
@@ -8668,7 +8735,6 @@
           </w:tcPr>
           <w:p>
             <w:pPr>
-              <w:spacing w:line="276" w:lineRule="auto"/>
               <w:rPr/>
             </w:pPr>
             <w:r>
@@ -8684,7 +8750,7 @@
                 <w:rtl w:val="0"/>
               </w:rPr>
               <w:br w:type="textWrapping"/>
-              <w:t xml:space="preserve">(Student Dashboard &amp; Registration)</w:t>
+              <w:t xml:space="preserve">(Student Portal &amp; Registration)</w:t>
             </w:r>
           </w:p>
         </w:tc>
@@ -8699,7 +8765,6 @@
           </w:tcPr>
           <w:p>
             <w:pPr>
-              <w:spacing w:line="276" w:lineRule="auto"/>
               <w:rPr/>
             </w:pPr>
             <w:r>
@@ -8707,6 +8772,21 @@
                 <w:rtl w:val="0"/>
               </w:rPr>
               <w:t xml:space="preserve">- </w:t>
+            </w:r>
+            <w:r>
+              <w:rPr>
+                <w:b w:val="1"/>
+                <w:bCs w:val="1"/>
+                <w:rtl w:val="0"/>
+              </w:rPr>
+              <w:t xml:space="preserve">Cổng Sinh viên &amp; Đăng ký học phần:</w:t>
+            </w:r>
+            <w:r>
+              <w:rPr>
+                <w:rtl w:val="0"/>
+              </w:rPr>
+              <w:br w:type="textWrapping"/>
+              <w:t xml:space="preserve">  + </w:t>
             </w:r>
             <w:r>
               <w:rPr>
@@ -8733,7 +8813,7 @@
               <w:rPr>
                 <w:rtl w:val="0"/>
               </w:rPr>
-              <w:t xml:space="preserve">, Engine Đăng ký học phần (Check sĩ số, tín chỉ, phát hiện trùng lịch </w:t>
+              <w:t xml:space="preserve">, Engine Đăng ký học phần (Logic check sĩ số, giới hạn tín chỉ, trùng lịch </w:t>
             </w:r>
             <w:r>
               <w:rPr>
@@ -8746,9 +8826,9 @@
               <w:rPr>
                 <w:rtl w:val="0"/>
               </w:rPr>
-              <w:t xml:space="preserve">, xử lý Concurrency).</w:t>
+              <w:t xml:space="preserve">). Phối hợp với Team Lead tối ưu DB Locking.</w:t>
               <w:br w:type="textWrapping"/>
-              <w:t xml:space="preserve">- </w:t>
+              <w:t xml:space="preserve">  + </w:t>
             </w:r>
             <w:r>
               <w:rPr>
@@ -8762,21 +8842,7 @@
               <w:rPr>
                 <w:rtl w:val="0"/>
               </w:rPr>
-              <w:t xml:space="preserve"> Màn hình </w:t>
-            </w:r>
-            <w:r>
-              <w:rPr>
-                <w:b w:val="1"/>
-                <w:bCs w:val="1"/>
-                <w:rtl w:val="0"/>
-              </w:rPr>
-              <w:t xml:space="preserve">Student Dashboard</w:t>
-            </w:r>
-            <w:r>
-              <w:rPr>
-                <w:rtl w:val="0"/>
-              </w:rPr>
-              <w:t xml:space="preserve"> giống 100% ảnh đề bài + Trang Đăng ký học phần &amp; xử lý xung đột lịch học.</w:t>
+              <w:t xml:space="preserve"> Giao diện Student Dashboard (4 thẻ chỉ số, tiến độ học tập) &amp; Trang Đăng ký/Hủy học phần.</w:t>
             </w:r>
           </w:p>
         </w:tc>
@@ -8798,7 +8864,6 @@
           </w:tcPr>
           <w:p>
             <w:pPr>
-              <w:spacing w:line="276" w:lineRule="auto"/>
               <w:rPr/>
             </w:pPr>
             <w:r>
@@ -8807,7 +8872,7 @@
                 <w:bCs w:val="1"/>
                 <w:rtl w:val="0"/>
               </w:rPr>
-              <w:t xml:space="preserve">Member 5</w:t>
+              <w:t xml:space="preserve">Hoàng Văn Lương</w:t>
             </w:r>
             <w:r>
               <w:rPr>
@@ -8828,7 +8893,6 @@
           </w:tcPr>
           <w:p>
             <w:pPr>
-              <w:spacing w:line="276" w:lineRule="auto"/>
               <w:rPr/>
             </w:pPr>
             <w:r>
@@ -8837,14 +8901,14 @@
                 <w:bCs w:val="1"/>
                 <w:rtl w:val="0"/>
               </w:rPr>
-              <w:t xml:space="preserve">Full-stack Dev 4</w:t>
+              <w:t xml:space="preserve">Full-stack Dev / CI-CD &amp; QA</w:t>
             </w:r>
             <w:r>
               <w:rPr>
                 <w:rtl w:val="0"/>
               </w:rPr>
               <w:br w:type="textWrapping"/>
-              <w:t xml:space="preserve">(Lecturer &amp; Grading)</w:t>
+              <w:t xml:space="preserve">(Lecturer Portal &amp; Automation)</w:t>
             </w:r>
           </w:p>
         </w:tc>
@@ -8860,7 +8924,6 @@
           </w:tcPr>
           <w:p>
             <w:pPr>
-              <w:spacing w:line="276" w:lineRule="auto"/>
               <w:rPr/>
             </w:pPr>
             <w:r>
@@ -8875,15 +8938,30 @@
                 <w:bCs w:val="1"/>
                 <w:rtl w:val="0"/>
               </w:rPr>
+              <w:t xml:space="preserve">Cổng Giảng viên &amp; Quản lý điểm:</w:t>
+            </w:r>
+            <w:r>
+              <w:rPr>
+                <w:rtl w:val="0"/>
+              </w:rPr>
+              <w:br w:type="textWrapping"/>
+              <w:t xml:space="preserve">  + </w:t>
+            </w:r>
+            <w:r>
+              <w:rPr>
+                <w:b w:val="1"/>
+                <w:bCs w:val="1"/>
+                <w:rtl w:val="0"/>
+              </w:rPr>
               <w:t xml:space="preserve">BE:</w:t>
             </w:r>
             <w:r>
               <w:rPr>
                 <w:rtl w:val="0"/>
               </w:rPr>
-              <w:t xml:space="preserve"> API Giảng viên xem lớp, điểm danh chuyên cần, nhập điểm thành phần, công thức tự động tính điểm tổng kết &amp; cập nhật CGPA.</w:t>
+              <w:t xml:space="preserve"> API danh sách lớp dạy, cập nhật chuyên cần, nhập/sửa điểm &amp; tự động tính điểm tổng kết/C-GPA.</w:t>
               <w:br w:type="textWrapping"/>
-              <w:t xml:space="preserve">- </w:t>
+              <w:t xml:space="preserve">  + </w:t>
             </w:r>
             <w:r>
               <w:rPr>
@@ -8897,172 +8975,7 @@
               <w:rPr>
                 <w:rtl w:val="0"/>
               </w:rPr>
-              <w:t xml:space="preserve"> Cổng Giảng viên (Danh sách lớp dạy, Bảng nhập điểm trực tiếp trên lưới) và Trang xem bảng điểm của Sinh viên.</w:t>
-            </w:r>
-          </w:p>
-        </w:tc>
-      </w:tr>
-      <w:tr>
-        <w:trPr>
-          <w:cantSplit w:val="0"/>
-          <w:tblHeader w:val="0"/>
-        </w:trPr>
-        <w:tc>
-          <w:tcPr>
-            <w:tcBorders>
-              <w:top w:color="d9d9d9" w:space="0" w:sz="8" w:val="single"/>
-              <w:left w:color="d9d9d9" w:space="0" w:sz="8" w:val="single"/>
-              <w:bottom w:color="d9d9d9" w:space="0" w:sz="8" w:val="single"/>
-              <w:right w:color="d9d9d9" w:space="0" w:sz="8" w:val="single"/>
-            </w:tcBorders>
-          </w:tcPr>
-          <w:p>
-            <w:pPr>
-              <w:spacing w:line="276" w:lineRule="auto"/>
-              <w:rPr/>
-            </w:pPr>
-            <w:r>
-              <w:rPr>
-                <w:b w:val="1"/>
-                <w:bCs w:val="1"/>
-                <w:rtl w:val="0"/>
-              </w:rPr>
-              <w:t xml:space="preserve">Member 6</w:t>
-            </w:r>
-            <w:r>
-              <w:rPr>
-                <w:rtl w:val="0"/>
-              </w:rPr>
-            </w:r>
-          </w:p>
-        </w:tc>
-        <w:tc>
-          <w:tcPr>
-            <w:tcBorders>
-              <w:top w:color="d9d9d9" w:space="0" w:sz="8" w:val="single"/>
-              <w:left w:color="d9d9d9" w:space="0" w:sz="8" w:val="single"/>
-              <w:bottom w:color="d9d9d9" w:space="0" w:sz="8" w:val="single"/>
-              <w:right w:color="d9d9d9" w:space="0" w:sz="8" w:val="single"/>
-            </w:tcBorders>
-          </w:tcPr>
-          <w:p>
-            <w:pPr>
-              <w:spacing w:line="276" w:lineRule="auto"/>
-              <w:rPr/>
-            </w:pPr>
-            <w:r>
-              <w:rPr>
-                <w:b w:val="1"/>
-                <w:bCs w:val="1"/>
-                <w:rtl w:val="0"/>
-              </w:rPr>
-              <w:t xml:space="preserve">QA / Tester / DevOps</w:t>
-            </w:r>
-            <w:r>
-              <w:rPr>
-                <w:rtl w:val="0"/>
-              </w:rPr>
-            </w:r>
-          </w:p>
-        </w:tc>
-        <w:tc>
-          <w:tcPr>
-            <w:tcBorders>
-              <w:top w:color="d9d9d9" w:space="0" w:sz="8" w:val="single"/>
-              <w:left w:color="d9d9d9" w:space="0" w:sz="8" w:val="single"/>
-              <w:bottom w:color="d9d9d9" w:space="0" w:sz="8" w:val="single"/>
-              <w:right w:color="d9d9d9" w:space="0" w:sz="8" w:val="single"/>
-            </w:tcBorders>
-          </w:tcPr>
-          <w:p>
-            <w:pPr>
-              <w:spacing w:line="276" w:lineRule="auto"/>
-              <w:rPr/>
-            </w:pPr>
-            <w:r>
-              <w:rPr>
-                <w:rtl w:val="0"/>
-              </w:rPr>
-              <w:t xml:space="preserve">- </w:t>
-            </w:r>
-            <w:r>
-              <w:rPr>
-                <w:b w:val="1"/>
-                <w:bCs w:val="1"/>
-                <w:rtl w:val="0"/>
-              </w:rPr>
-              <w:t xml:space="preserve">DevOps:</w:t>
-            </w:r>
-            <w:r>
-              <w:rPr>
-                <w:rtl w:val="0"/>
-              </w:rPr>
-              <w:t xml:space="preserve"> Viết </w:t>
-            </w:r>
-            <w:r>
-              <w:rPr>
-                <w:color w:val="188038"/>
-                <w:rtl w:val="0"/>
-              </w:rPr>
-              <w:t xml:space="preserve">Dockerfile</w:t>
-            </w:r>
-            <w:r>
-              <w:rPr>
-                <w:rtl w:val="0"/>
-              </w:rPr>
-              <w:t xml:space="preserve"> cho BE/FE, </w:t>
-            </w:r>
-            <w:r>
-              <w:rPr>
-                <w:color w:val="188038"/>
-                <w:rtl w:val="0"/>
-              </w:rPr>
-              <w:t xml:space="preserve">docker-compose.yml</w:t>
-            </w:r>
-            <w:r>
-              <w:rPr>
-                <w:rtl w:val="0"/>
-              </w:rPr>
-              <w:t xml:space="preserve"> (cấu hình PostgreSQL, biến môi trường đa môi trường </w:t>
-            </w:r>
-            <w:r>
-              <w:rPr>
-                <w:color w:val="188038"/>
-                <w:rtl w:val="0"/>
-              </w:rPr>
-              <w:t xml:space="preserve">dev</w:t>
-            </w:r>
-            <w:r>
-              <w:rPr>
-                <w:rtl w:val="0"/>
-              </w:rPr>
-              <w:t xml:space="preserve">/</w:t>
-            </w:r>
-            <w:r>
-              <w:rPr>
-                <w:color w:val="188038"/>
-                <w:rtl w:val="0"/>
-              </w:rPr>
-              <w:t xml:space="preserve">staging</w:t>
-            </w:r>
-            <w:r>
-              <w:rPr>
-                <w:rtl w:val="0"/>
-              </w:rPr>
-              <w:t xml:space="preserve">/</w:t>
-            </w:r>
-            <w:r>
-              <w:rPr>
-                <w:color w:val="188038"/>
-                <w:rtl w:val="0"/>
-              </w:rPr>
-              <w:t xml:space="preserve">prod</w:t>
-            </w:r>
-            <w:r>
-              <w:rPr>
-                <w:rtl w:val="0"/>
-              </w:rPr>
-              <w:t xml:space="preserve">), thiết lập GitHub Actions CI/CD.</w:t>
+              <w:t xml:space="preserve"> Màn hình Cổng giảng viên &amp; Trang Xem điểm sinh viên.</w:t>
               <w:br w:type="textWrapping"/>
               <w:t xml:space="preserve">- </w:t>
             </w:r>
@@ -9072,13 +8985,13 @@
                 <w:bCs w:val="1"/>
                 <w:rtl w:val="0"/>
               </w:rPr>
-              <w:t xml:space="preserve">Testing:</w:t>
+              <w:t xml:space="preserve">CI/CD &amp; QA Automation:</w:t>
             </w:r>
             <w:r>
               <w:rPr>
                 <w:rtl w:val="0"/>
               </w:rPr>
-              <w:t xml:space="preserve"> Viết bộ Postman Collection kiểm thử toàn bộ API (tự động chạy qua Newman trên CI/CD), kiểm thử E2E các quy tắc đăng ký học phần.</w:t>
+              <w:t xml:space="preserve"> Cấu hình GitHub Actions pipeline &amp; viết bộ Postman/Newman Collection kiểm thử tự động API.</w:t>
             </w:r>
           </w:p>
         </w:tc>

</xml_diff>